<commit_message>
Added Document-01 SqoopDataIngestion.pdf and Document-02 SparkETLCode.ipynb
</commit_message>
<xml_diff>
--- a/answer/Sample-Template-SqoopDataIngestion.docx
+++ b/answer/Sample-Template-SqoopDataIngestion.docx
@@ -15,6 +15,11 @@
     <w:p/>
     <w:p>
       <w:pPr>
+        <w:pStyle w:val="ListParagraph"/>
+        <w:numPr>
+          <w:ilvl w:val="0"/>
+          <w:numId w:val="2"/>
+        </w:numPr>
         <w:rPr>
           <w:b/>
         </w:rPr>
@@ -23,7 +28,21 @@
         <w:rPr>
           <w:b/>
         </w:rPr>
-        <w:t>Sqoop Import command used for importing table from RDS to HDFS:</w:t>
+        <w:t xml:space="preserve">Sqoop Import command used for importing </w:t>
+      </w:r>
+      <w:proofErr w:type="gramStart"/>
+      <w:r>
+        <w:rPr>
+          <w:b/>
+        </w:rPr>
+        <w:t>table</w:t>
+      </w:r>
+      <w:proofErr w:type="gramEnd"/>
+      <w:r>
+        <w:rPr>
+          <w:b/>
+        </w:rPr>
+        <w:t xml:space="preserve"> from RDS to HDFS:</w:t>
       </w:r>
     </w:p>
     <w:p/>
@@ -114,7 +133,130 @@
     </w:p>
     <w:p/>
     <w:p>
-      <w:pPr>
+      <w:r>
+        <w:t>Explanation of the Sqoop Parameters:</w:t>
+      </w:r>
+    </w:p>
+    <w:p/>
+    <w:p>
+      <w:r>
+        <w:t>--connect</w:t>
+      </w:r>
+      <w:r>
+        <w:t xml:space="preserve">, </w:t>
+      </w:r>
+      <w:r>
+        <w:t>username</w:t>
+      </w:r>
+      <w:r>
+        <w:t xml:space="preserve">, </w:t>
+      </w:r>
+      <w:r>
+        <w:t>password</w:t>
+      </w:r>
+      <w:r>
+        <w:t>, and table:</w:t>
+      </w:r>
+    </w:p>
+    <w:p>
+      <w:r>
+        <w:t>Credentials</w:t>
+      </w:r>
+      <w:r>
+        <w:t xml:space="preserve"> and source table</w:t>
+      </w:r>
+      <w:r>
+        <w:t xml:space="preserve"> </w:t>
+      </w:r>
+      <w:r>
+        <w:t>provided by the assignment.</w:t>
+      </w:r>
+    </w:p>
+    <w:p/>
+    <w:p>
+      <w:r>
+        <w:t>--target-</w:t>
+      </w:r>
+      <w:proofErr w:type="spellStart"/>
+      <w:r>
+        <w:t>dir</w:t>
+      </w:r>
+      <w:proofErr w:type="spellEnd"/>
+      <w:r>
+        <w:t xml:space="preserve"> /user/</w:t>
+      </w:r>
+      <w:proofErr w:type="spellStart"/>
+      <w:r>
+        <w:t>hadoop</w:t>
+      </w:r>
+      <w:proofErr w:type="spellEnd"/>
+      <w:r>
+        <w:t>/</w:t>
+      </w:r>
+      <w:proofErr w:type="spellStart"/>
+      <w:r>
+        <w:t>atm_raw</w:t>
+      </w:r>
+      <w:proofErr w:type="spellEnd"/>
+    </w:p>
+    <w:p>
+      <w:r>
+        <w:t>Specifies the HDFS directory where the imported data will be stored.</w:t>
+      </w:r>
+    </w:p>
+    <w:p/>
+    <w:p>
+      <w:r>
+        <w:t>--as-</w:t>
+      </w:r>
+      <w:proofErr w:type="spellStart"/>
+      <w:r>
+        <w:t>textfile</w:t>
+      </w:r>
+      <w:proofErr w:type="spellEnd"/>
+    </w:p>
+    <w:p>
+      <w:r>
+        <w:t>Imports the data in plain text forma for schema</w:t>
+      </w:r>
+      <w:r>
+        <w:rPr>
+          <w:rFonts w:ascii="Cambria Math" w:hAnsi="Cambria Math" w:cs="Cambria Math"/>
+        </w:rPr>
+        <w:t>‑</w:t>
+      </w:r>
+      <w:r>
+        <w:t xml:space="preserve">based reading later using </w:t>
+      </w:r>
+      <w:proofErr w:type="spellStart"/>
+      <w:r>
+        <w:t>PySpark</w:t>
+      </w:r>
+      <w:proofErr w:type="spellEnd"/>
+      <w:r>
+        <w:t>.</w:t>
+      </w:r>
+    </w:p>
+    <w:p/>
+    <w:p>
+      <w:r>
+        <w:t>-m 1</w:t>
+      </w:r>
+    </w:p>
+    <w:p>
+      <w:r>
+        <w:t>Forces Sqoop to use a single mapper. This option was required because the source table does not have a primary key that could be used for parallel splitting.</w:t>
+      </w:r>
+    </w:p>
+    <w:p/>
+    <w:p/>
+    <w:p>
+      <w:pPr>
+        <w:pStyle w:val="ListParagraph"/>
+        <w:numPr>
+          <w:ilvl w:val="0"/>
+          <w:numId w:val="2"/>
+        </w:numPr>
         <w:rPr>
           <w:b/>
         </w:rPr>
@@ -195,6 +337,11 @@
     <w:p/>
     <w:p>
       <w:pPr>
+        <w:pStyle w:val="ListParagraph"/>
+        <w:numPr>
+          <w:ilvl w:val="0"/>
+          <w:numId w:val="2"/>
+        </w:numPr>
         <w:rPr>
           <w:b/>
         </w:rPr>
@@ -218,6 +365,7 @@
         <w:rPr>
           <w:noProof/>
         </w:rPr>
+        <w:lastRenderedPageBreak/>
         <w:drawing>
           <wp:inline distT="0" distB="0" distL="0" distR="0" wp14:anchorId="5C7A52B3" wp14:editId="021E8AAF">
             <wp:extent cx="5943600" cy="1372235"/>
@@ -234,7 +382,7 @@
                     <pic:cNvPicPr/>
                   </pic:nvPicPr>
                   <pic:blipFill>
-                    <a:blip r:embed="rId6"/>
+                    <a:blip r:embed="rId7"/>
                     <a:stretch>
                       <a:fillRect/>
                     </a:stretch>
@@ -256,8 +404,8 @@
       </w:r>
     </w:p>
     <w:sectPr>
-      <w:headerReference w:type="default" r:id="rId7"/>
-      <w:footerReference w:type="default" r:id="rId8"/>
+      <w:headerReference w:type="default" r:id="rId8"/>
+      <w:footerReference w:type="default" r:id="rId9"/>
       <w:pgSz w:w="12240" w:h="15840"/>
       <w:pgMar w:top="1440" w:right="1440" w:bottom="1440" w:left="1440" w:header="720" w:footer="720" w:gutter="0"/>
       <w:pgNumType w:start="1"/>
@@ -462,6 +610,195 @@
     </w:r>
   </w:p>
 </w:hdr>
+</file>
+
+<file path=word/numbering.xml><?xml version="1.0" encoding="utf-8"?>
+<w:numbering xmlns:wpc="http://schemas.microsoft.com/office/word/2010/wordprocessingCanvas" xmlns:cx="http://schemas.microsoft.com/office/drawing/2014/chartex" xmlns:cx1="http://schemas.microsoft.com/office/drawing/2015/9/8/chartex" xmlns:cx2="http://schemas.microsoft.com/office/drawing/2015/10/21/chartex" xmlns:cx3="http://schemas.microsoft.com/office/drawing/2016/5/9/chartex" xmlns:cx4="http://schemas.microsoft.com/office/drawing/2016/5/10/chartex" xmlns:cx5="http://schemas.microsoft.com/office/drawing/2016/5/11/chartex" xmlns:cx6="http://schemas.microsoft.com/office/drawing/2016/5/12/chartex" xmlns:cx7="http://schemas.microsoft.com/office/drawing/2016/5/13/chartex" xmlns:cx8="http://schemas.microsoft.com/office/drawing/2016/5/14/chartex" xmlns:mc="http://schemas.openxmlformats.org/markup-compatibility/2006" xmlns:aink="http://schemas.microsoft.com/office/drawing/2016/ink" xmlns:am3d="http://schemas.microsoft.com/office/drawing/2017/model3d" xmlns:o="urn:schemas-microsoft-com:office:office" xmlns:oel="http://schemas.microsoft.com/office/2019/extlst" xmlns:r="http://schemas.openxmlformats.org/officeDocument/2006/relationships" xmlns:m="http://schemas.openxmlformats.org/officeDocument/2006/math" xmlns:v="urn:schemas-microsoft-com:vml" xmlns:wp14="http://schemas.microsoft.com/office/word/2010/wordprocessingDrawing" xmlns:wp="http://schemas.openxmlformats.org/drawingml/2006/wordprocessingDrawing" xmlns:w10="urn:schemas-microsoft-com:office:word" xmlns:w="http://schemas.openxmlformats.org/wordprocessingml/2006/main" xmlns:w14="http://schemas.microsoft.com/office/word/2010/wordml" xmlns:w15="http://schemas.microsoft.com/office/word/2012/wordml" xmlns:w16cex="http://schemas.microsoft.com/office/word/2018/wordml/cex" xmlns:w16cid="http://schemas.microsoft.com/office/word/2016/wordml/cid" xmlns:w16="http://schemas.microsoft.com/office/word/2018/wordml" xmlns:w16du="http://schemas.microsoft.com/office/word/2023/wordml/word16du" xmlns:w16sdtdh="http://schemas.microsoft.com/office/word/2020/wordml/sdtdatahash" xmlns:w16sdtfl="http://schemas.microsoft.com/office/word/2024/wordml/sdtformatlock" xmlns:w16se="http://schemas.microsoft.com/office/word/2015/wordml/symex" xmlns:wpg="http://schemas.microsoft.com/office/word/2010/wordprocessingGroup" xmlns:wpi="http://schemas.microsoft.com/office/word/2010/wordprocessingInk" xmlns:wne="http://schemas.microsoft.com/office/word/2006/wordml" xmlns:wps="http://schemas.microsoft.com/office/word/2010/wordprocessingShape" mc:Ignorable="w14 w15 w16se w16cid w16 w16cex w16sdtdh w16sdtfl w16du wp14">
+  <w:abstractNum w:abstractNumId="0" w15:restartNumberingAfterBreak="0">
+    <w:nsid w:val="14692919"/>
+    <w:multiLevelType w:val="hybridMultilevel"/>
+    <w:tmpl w:val="054EF7D0"/>
+    <w:lvl w:ilvl="0" w:tplc="B5643FDA">
+      <w:start w:val="1"/>
+      <w:numFmt w:val="upperRoman"/>
+      <w:lvlText w:val="%1."/>
+      <w:lvlJc w:val="left"/>
+      <w:pPr>
+        <w:ind w:left="1080" w:hanging="720"/>
+      </w:pPr>
+      <w:rPr>
+        <w:rFonts w:hint="default"/>
+      </w:rPr>
+    </w:lvl>
+    <w:lvl w:ilvl="1" w:tplc="04090019" w:tentative="1">
+      <w:start w:val="1"/>
+      <w:numFmt w:val="lowerLetter"/>
+      <w:lvlText w:val="%2."/>
+      <w:lvlJc w:val="left"/>
+      <w:pPr>
+        <w:ind w:left="1440" w:hanging="360"/>
+      </w:pPr>
+    </w:lvl>
+    <w:lvl w:ilvl="2" w:tplc="0409001B" w:tentative="1">
+      <w:start w:val="1"/>
+      <w:numFmt w:val="lowerRoman"/>
+      <w:lvlText w:val="%3."/>
+      <w:lvlJc w:val="right"/>
+      <w:pPr>
+        <w:ind w:left="2160" w:hanging="180"/>
+      </w:pPr>
+    </w:lvl>
+    <w:lvl w:ilvl="3" w:tplc="0409000F" w:tentative="1">
+      <w:start w:val="1"/>
+      <w:numFmt w:val="decimal"/>
+      <w:lvlText w:val="%4."/>
+      <w:lvlJc w:val="left"/>
+      <w:pPr>
+        <w:ind w:left="2880" w:hanging="360"/>
+      </w:pPr>
+    </w:lvl>
+    <w:lvl w:ilvl="4" w:tplc="04090019" w:tentative="1">
+      <w:start w:val="1"/>
+      <w:numFmt w:val="lowerLetter"/>
+      <w:lvlText w:val="%5."/>
+      <w:lvlJc w:val="left"/>
+      <w:pPr>
+        <w:ind w:left="3600" w:hanging="360"/>
+      </w:pPr>
+    </w:lvl>
+    <w:lvl w:ilvl="5" w:tplc="0409001B" w:tentative="1">
+      <w:start w:val="1"/>
+      <w:numFmt w:val="lowerRoman"/>
+      <w:lvlText w:val="%6."/>
+      <w:lvlJc w:val="right"/>
+      <w:pPr>
+        <w:ind w:left="4320" w:hanging="180"/>
+      </w:pPr>
+    </w:lvl>
+    <w:lvl w:ilvl="6" w:tplc="0409000F" w:tentative="1">
+      <w:start w:val="1"/>
+      <w:numFmt w:val="decimal"/>
+      <w:lvlText w:val="%7."/>
+      <w:lvlJc w:val="left"/>
+      <w:pPr>
+        <w:ind w:left="5040" w:hanging="360"/>
+      </w:pPr>
+    </w:lvl>
+    <w:lvl w:ilvl="7" w:tplc="04090019" w:tentative="1">
+      <w:start w:val="1"/>
+      <w:numFmt w:val="lowerLetter"/>
+      <w:lvlText w:val="%8."/>
+      <w:lvlJc w:val="left"/>
+      <w:pPr>
+        <w:ind w:left="5760" w:hanging="360"/>
+      </w:pPr>
+    </w:lvl>
+    <w:lvl w:ilvl="8" w:tplc="0409001B" w:tentative="1">
+      <w:start w:val="1"/>
+      <w:numFmt w:val="lowerRoman"/>
+      <w:lvlText w:val="%9."/>
+      <w:lvlJc w:val="right"/>
+      <w:pPr>
+        <w:ind w:left="6480" w:hanging="180"/>
+      </w:pPr>
+    </w:lvl>
+  </w:abstractNum>
+  <w:abstractNum w:abstractNumId="1" w15:restartNumberingAfterBreak="0">
+    <w:nsid w:val="50DE1B0F"/>
+    <w:multiLevelType w:val="hybridMultilevel"/>
+    <w:tmpl w:val="C6D0B43E"/>
+    <w:lvl w:ilvl="0" w:tplc="AD201194">
+      <w:start w:val="1"/>
+      <w:numFmt w:val="upperRoman"/>
+      <w:lvlText w:val="%1&gt;"/>
+      <w:lvlJc w:val="left"/>
+      <w:pPr>
+        <w:ind w:left="1080" w:hanging="720"/>
+      </w:pPr>
+      <w:rPr>
+        <w:rFonts w:hint="default"/>
+      </w:rPr>
+    </w:lvl>
+    <w:lvl w:ilvl="1" w:tplc="04090019" w:tentative="1">
+      <w:start w:val="1"/>
+      <w:numFmt w:val="lowerLetter"/>
+      <w:lvlText w:val="%2."/>
+      <w:lvlJc w:val="left"/>
+      <w:pPr>
+        <w:ind w:left="1440" w:hanging="360"/>
+      </w:pPr>
+    </w:lvl>
+    <w:lvl w:ilvl="2" w:tplc="0409001B" w:tentative="1">
+      <w:start w:val="1"/>
+      <w:numFmt w:val="lowerRoman"/>
+      <w:lvlText w:val="%3."/>
+      <w:lvlJc w:val="right"/>
+      <w:pPr>
+        <w:ind w:left="2160" w:hanging="180"/>
+      </w:pPr>
+    </w:lvl>
+    <w:lvl w:ilvl="3" w:tplc="0409000F" w:tentative="1">
+      <w:start w:val="1"/>
+      <w:numFmt w:val="decimal"/>
+      <w:lvlText w:val="%4."/>
+      <w:lvlJc w:val="left"/>
+      <w:pPr>
+        <w:ind w:left="2880" w:hanging="360"/>
+      </w:pPr>
+    </w:lvl>
+    <w:lvl w:ilvl="4" w:tplc="04090019" w:tentative="1">
+      <w:start w:val="1"/>
+      <w:numFmt w:val="lowerLetter"/>
+      <w:lvlText w:val="%5."/>
+      <w:lvlJc w:val="left"/>
+      <w:pPr>
+        <w:ind w:left="3600" w:hanging="360"/>
+      </w:pPr>
+    </w:lvl>
+    <w:lvl w:ilvl="5" w:tplc="0409001B" w:tentative="1">
+      <w:start w:val="1"/>
+      <w:numFmt w:val="lowerRoman"/>
+      <w:lvlText w:val="%6."/>
+      <w:lvlJc w:val="right"/>
+      <w:pPr>
+        <w:ind w:left="4320" w:hanging="180"/>
+      </w:pPr>
+    </w:lvl>
+    <w:lvl w:ilvl="6" w:tplc="0409000F" w:tentative="1">
+      <w:start w:val="1"/>
+      <w:numFmt w:val="decimal"/>
+      <w:lvlText w:val="%7."/>
+      <w:lvlJc w:val="left"/>
+      <w:pPr>
+        <w:ind w:left="5040" w:hanging="360"/>
+      </w:pPr>
+    </w:lvl>
+    <w:lvl w:ilvl="7" w:tplc="04090019" w:tentative="1">
+      <w:start w:val="1"/>
+      <w:numFmt w:val="lowerLetter"/>
+      <w:lvlText w:val="%8."/>
+      <w:lvlJc w:val="left"/>
+      <w:pPr>
+        <w:ind w:left="5760" w:hanging="360"/>
+      </w:pPr>
+    </w:lvl>
+    <w:lvl w:ilvl="8" w:tplc="0409001B" w:tentative="1">
+      <w:start w:val="1"/>
+      <w:numFmt w:val="lowerRoman"/>
+      <w:lvlText w:val="%9."/>
+      <w:lvlJc w:val="right"/>
+      <w:pPr>
+        <w:ind w:left="6480" w:hanging="180"/>
+      </w:pPr>
+    </w:lvl>
+  </w:abstractNum>
+  <w:num w:numId="1" w16cid:durableId="43258265">
+    <w:abstractNumId w:val="1"/>
+  </w:num>
+  <w:num w:numId="2" w16cid:durableId="801969492">
+    <w:abstractNumId w:val="0"/>
+  </w:num>
+</w:numbering>
 </file>
 
 <file path=word/styles.xml><?xml version="1.0" encoding="utf-8"?>
@@ -1078,6 +1415,17 @@
     <w:uiPriority w:val="99"/>
     <w:rsid w:val="00F82793"/>
   </w:style>
+  <w:style w:type="paragraph" w:styleId="ListParagraph">
+    <w:name w:val="List Paragraph"/>
+    <w:basedOn w:val="Normal"/>
+    <w:uiPriority w:val="34"/>
+    <w:qFormat/>
+    <w:rsid w:val="00E64458"/>
+    <w:pPr>
+      <w:ind w:left="720"/>
+      <w:contextualSpacing/>
+    </w:pPr>
+  </w:style>
 </w:styles>
 </file>
 

</xml_diff>